<commit_message>
Update resume reference details
</commit_message>
<xml_diff>
--- a/Jaraad-Ramsey-Resume-2026.docx
+++ b/Jaraad-Ramsey-Resume-2026.docx
@@ -476,6 +476,24 @@
         <w:rPr>
           <w:rFonts w:ascii="Arial" w:hAnsi="Arial"/>
           <w:b w:val="0"/>
+          <w:color w:val="000000"/>
+          <w:sz w:val="21"/>
+        </w:rPr>
+        <w:t>Expro Workshop Supervisor</w:t>
+      </w:r>
+      <w:r>
+        <w:rPr>
+          <w:rFonts w:ascii="Arial" w:hAnsi="Arial"/>
+          <w:b w:val="0"/>
+          <w:color w:val="555555"/>
+          <w:sz w:val="21"/>
+        </w:rPr>
+        <w:t xml:space="preserve">  |  </w:t>
+      </w:r>
+      <w:r>
+        <w:rPr>
+          <w:rFonts w:ascii="Arial" w:hAnsi="Arial"/>
+          <w:b w:val="0"/>
           <w:color w:val="555555"/>
           <w:sz w:val="21"/>
         </w:rPr>
@@ -509,10 +527,28 @@
         <w:rPr>
           <w:rFonts w:ascii="Arial" w:hAnsi="Arial"/>
           <w:b w:val="0"/>
+          <w:color w:val="000000"/>
+          <w:sz w:val="21"/>
+        </w:rPr>
+        <w:t>Expro Subsea Supervisor</w:t>
+      </w:r>
+      <w:r>
+        <w:rPr>
+          <w:rFonts w:ascii="Arial" w:hAnsi="Arial"/>
+          <w:b w:val="0"/>
           <w:color w:val="555555"/>
           <w:sz w:val="21"/>
         </w:rPr>
-        <w:t>+86 185 7670 0208</w:t>
+        <w:t xml:space="preserve">  |  </w:t>
+      </w:r>
+      <w:r>
+        <w:rPr>
+          <w:rFonts w:ascii="Arial" w:hAnsi="Arial"/>
+          <w:b w:val="0"/>
+          <w:color w:val="555555"/>
+          <w:sz w:val="21"/>
+        </w:rPr>
+        <w:t>+61 405 729 065</w:t>
       </w:r>
     </w:p>
     <w:sectPr>

</xml_diff>